<commit_message>
refactor: remove legacy OKR AI refinement path
</commit_message>
<xml_diff>
--- a/docs/BaoCao_DuAn_TotNghiep_HoanThien_20260811.docx
+++ b/docs/BaoCao_DuAn_TotNghiep_HoanThien_20260811.docx
@@ -602,7 +602,7 @@
         <w:jc w:val="center"/>
         <w:rPr/>
       </w:pPr>
-      <w:bookmarkStart w:id="0" w:name="__RefHeading___Toc3820_1075034909"/>
+      <w:bookmarkStart w:id="0" w:name="__RefHeading___Toc3820_1528650690"/>
       <w:bookmarkEnd w:id="0"/>
       <w:r>
         <w:rPr>
@@ -650,7 +650,7 @@
             </w:rPr>
             <w:fldChar w:fldCharType="separate"/>
           </w:r>
-          <w:hyperlink w:anchor="__RefHeading___Toc3820_1075034909" w:tooltip="MỤC LỤC">
+          <w:hyperlink w:anchor="__RefHeading___Toc3820_1528650690" w:tooltip="MỤC LỤC">
             <w:r>
               <w:rPr>
                 <w:rStyle w:val="IndexLink"/>
@@ -677,7 +677,7 @@
             </w:tabs>
             <w:rPr/>
           </w:pPr>
-          <w:hyperlink w:anchor="__RefHeading___Toc3822_1075034909" w:tooltip="DANH MỤC HÌNH ẢNH">
+          <w:hyperlink w:anchor="__RefHeading___Toc3822_1528650690" w:tooltip="DANH MỤC HÌNH ẢNH">
             <w:r>
               <w:rPr>
                 <w:rStyle w:val="IndexLink"/>
@@ -704,7 +704,7 @@
             </w:tabs>
             <w:rPr/>
           </w:pPr>
-          <w:hyperlink w:anchor="__RefHeading___Toc3824_1075034909" w:tooltip="DANH MỤC BẢNG BIỂU">
+          <w:hyperlink w:anchor="__RefHeading___Toc3824_1528650690" w:tooltip="DANH MỤC BẢNG BIỂU">
             <w:r>
               <w:rPr>
                 <w:rStyle w:val="IndexLink"/>
@@ -731,7 +731,7 @@
             </w:tabs>
             <w:rPr/>
           </w:pPr>
-          <w:hyperlink w:anchor="__RefHeading___Toc3826_1075034909" w:tooltip="THEO DÕI PHIÊN BẢN TÀI LIỆU">
+          <w:hyperlink w:anchor="__RefHeading___Toc3826_1528650690" w:tooltip="THEO DÕI PHIÊN BẢN TÀI LIỆU">
             <w:r>
               <w:rPr>
                 <w:rStyle w:val="IndexLink"/>
@@ -758,7 +758,7 @@
             </w:tabs>
             <w:rPr/>
           </w:pPr>
-          <w:hyperlink w:anchor="__RefHeading___Toc3828_1075034909" w:tooltip="BẢNG CHÚ GIẢI THUẬT NGỮ">
+          <w:hyperlink w:anchor="__RefHeading___Toc3828_1528650690" w:tooltip="BẢNG CHÚ GIẢI THUẬT NGỮ">
             <w:r>
               <w:rPr>
                 <w:rStyle w:val="IndexLink"/>
@@ -785,7 +785,7 @@
             </w:tabs>
             <w:rPr/>
           </w:pPr>
-          <w:hyperlink w:anchor="__RefHeading___Toc3830_1075034909" w:tooltip="DANH SÁCH THÀNH VIÊN">
+          <w:hyperlink w:anchor="__RefHeading___Toc3830_1528650690" w:tooltip="DANH SÁCH THÀNH VIÊN">
             <w:r>
               <w:rPr>
                 <w:rStyle w:val="IndexLink"/>
@@ -812,7 +812,7 @@
             </w:tabs>
             <w:rPr/>
           </w:pPr>
-          <w:hyperlink w:anchor="__RefHeading___Toc3832_1075034909" w:tooltip="GIẢNG VIÊN HƯỚNG DẪN">
+          <w:hyperlink w:anchor="__RefHeading___Toc3832_1528650690" w:tooltip="GIẢNG VIÊN HƯỚNG DẪN">
             <w:r>
               <w:rPr>
                 <w:rStyle w:val="IndexLink"/>
@@ -839,7 +839,7 @@
             </w:tabs>
             <w:rPr/>
           </w:pPr>
-          <w:hyperlink w:anchor="__RefHeading___Toc3834_1075034909" w:tooltip="LỜI CẢM ƠN">
+          <w:hyperlink w:anchor="__RefHeading___Toc3834_1528650690" w:tooltip="LỜI CẢM ƠN">
             <w:r>
               <w:rPr>
                 <w:rStyle w:val="IndexLink"/>
@@ -866,7 +866,7 @@
             </w:tabs>
             <w:rPr/>
           </w:pPr>
-          <w:hyperlink w:anchor="__RefHeading___Toc3836_1075034909" w:tooltip="LỜI MỞ ĐẦU">
+          <w:hyperlink w:anchor="__RefHeading___Toc3836_1528650690" w:tooltip="LỜI MỞ ĐẦU">
             <w:r>
               <w:rPr>
                 <w:rStyle w:val="IndexLink"/>
@@ -893,7 +893,7 @@
             </w:tabs>
             <w:rPr/>
           </w:pPr>
-          <w:hyperlink w:anchor="__RefHeading___Toc3838_1075034909" w:tooltip="TÓM TẮT NỘI DUNG DỰ ÁN">
+          <w:hyperlink w:anchor="__RefHeading___Toc3838_1528650690" w:tooltip="TÓM TẮT NỘI DUNG DỰ ÁN">
             <w:r>
               <w:rPr>
                 <w:rStyle w:val="IndexLink"/>
@@ -920,7 +920,7 @@
             </w:tabs>
             <w:rPr/>
           </w:pPr>
-          <w:hyperlink w:anchor="__RefHeading___Toc3840_1075034909" w:tooltip="CHƯƠNG 1: GIỚI THIỆU">
+          <w:hyperlink w:anchor="__RefHeading___Toc3840_1528650690" w:tooltip="CHƯƠNG 1: GIỚI THIỆU">
             <w:r>
               <w:rPr>
                 <w:rStyle w:val="IndexLink"/>
@@ -947,7 +947,7 @@
             </w:tabs>
             <w:rPr/>
           </w:pPr>
-          <w:hyperlink w:anchor="__RefHeading___Toc3842_1075034909" w:tooltip="1.1. Bối cảnh và lý do chọn đề tài">
+          <w:hyperlink w:anchor="__RefHeading___Toc3842_1528650690" w:tooltip="1.1. Bối cảnh và lý do chọn đề tài">
             <w:r>
               <w:rPr>
                 <w:rStyle w:val="IndexLink"/>
@@ -974,7 +974,7 @@
             </w:tabs>
             <w:rPr/>
           </w:pPr>
-          <w:hyperlink w:anchor="__RefHeading___Toc3844_1075034909" w:tooltip="1.1.1. Bài toán quản trị hiệu suất">
+          <w:hyperlink w:anchor="__RefHeading___Toc3844_1528650690" w:tooltip="1.1.1. Bài toán quản trị hiệu suất">
             <w:r>
               <w:rPr>
                 <w:rStyle w:val="IndexLink"/>
@@ -1001,7 +1001,7 @@
             </w:tabs>
             <w:rPr/>
           </w:pPr>
-          <w:hyperlink w:anchor="__RefHeading___Toc3846_1075034909" w:tooltip="1.1.2. Giá trị của giải pháp">
+          <w:hyperlink w:anchor="__RefHeading___Toc3846_1528650690" w:tooltip="1.1.2. Giá trị của giải pháp">
             <w:r>
               <w:rPr>
                 <w:rStyle w:val="IndexLink"/>
@@ -1028,7 +1028,7 @@
             </w:tabs>
             <w:rPr/>
           </w:pPr>
-          <w:hyperlink w:anchor="__RefHeading___Toc3848_1075034909" w:tooltip="1.2. Mục tiêu của đề tài">
+          <w:hyperlink w:anchor="__RefHeading___Toc3848_1528650690" w:tooltip="1.2. Mục tiêu của đề tài">
             <w:r>
               <w:rPr>
                 <w:rStyle w:val="IndexLink"/>
@@ -1055,7 +1055,7 @@
             </w:tabs>
             <w:rPr/>
           </w:pPr>
-          <w:hyperlink w:anchor="__RefHeading___Toc3850_1075034909" w:tooltip="1.2.1. Mục tiêu tổng quát">
+          <w:hyperlink w:anchor="__RefHeading___Toc3850_1528650690" w:tooltip="1.2.1. Mục tiêu tổng quát">
             <w:r>
               <w:rPr>
                 <w:rStyle w:val="IndexLink"/>
@@ -1082,7 +1082,7 @@
             </w:tabs>
             <w:rPr/>
           </w:pPr>
-          <w:hyperlink w:anchor="__RefHeading___Toc3852_1075034909" w:tooltip="1.2.2. Mục tiêu cụ thể">
+          <w:hyperlink w:anchor="__RefHeading___Toc3852_1528650690" w:tooltip="1.2.2. Mục tiêu cụ thể">
             <w:r>
               <w:rPr>
                 <w:rStyle w:val="IndexLink"/>
@@ -1109,7 +1109,7 @@
             </w:tabs>
             <w:rPr/>
           </w:pPr>
-          <w:hyperlink w:anchor="__RefHeading___Toc3854_1075034909" w:tooltip="1.3. Phạm vi bàn giao">
+          <w:hyperlink w:anchor="__RefHeading___Toc3854_1528650690" w:tooltip="1.3. Phạm vi bàn giao">
             <w:r>
               <w:rPr>
                 <w:rStyle w:val="IndexLink"/>
@@ -1136,7 +1136,7 @@
             </w:tabs>
             <w:rPr/>
           </w:pPr>
-          <w:hyperlink w:anchor="__RefHeading___Toc3856_1075034909" w:tooltip="1.4. Phương pháp thực hiện">
+          <w:hyperlink w:anchor="__RefHeading___Toc3856_1528650690" w:tooltip="1.4. Phương pháp thực hiện">
             <w:r>
               <w:rPr>
                 <w:rStyle w:val="IndexLink"/>
@@ -1163,7 +1163,7 @@
             </w:tabs>
             <w:rPr/>
           </w:pPr>
-          <w:hyperlink w:anchor="__RefHeading___Toc3858_1075034909" w:tooltip="CHƯƠNG 2: PHÂN TÍCH HỆ THỐNG">
+          <w:hyperlink w:anchor="__RefHeading___Toc3858_1528650690" w:tooltip="CHƯƠNG 2: PHÂN TÍCH HỆ THỐNG">
             <w:r>
               <w:rPr>
                 <w:rStyle w:val="IndexLink"/>
@@ -1190,7 +1190,7 @@
             </w:tabs>
             <w:rPr/>
           </w:pPr>
-          <w:hyperlink w:anchor="__RefHeading___Toc3860_1075034909" w:tooltip="2.1. Tác nhân hệ thống">
+          <w:hyperlink w:anchor="__RefHeading___Toc3860_1528650690" w:tooltip="2.1. Tác nhân hệ thống">
             <w:r>
               <w:rPr>
                 <w:rStyle w:val="IndexLink"/>
@@ -1217,7 +1217,7 @@
             </w:tabs>
             <w:rPr/>
           </w:pPr>
-          <w:hyperlink w:anchor="__RefHeading___Toc3862_1075034909" w:tooltip="2.2. Yêu cầu chức năng">
+          <w:hyperlink w:anchor="__RefHeading___Toc3862_1528650690" w:tooltip="2.2. Yêu cầu chức năng">
             <w:r>
               <w:rPr>
                 <w:rStyle w:val="IndexLink"/>
@@ -1244,7 +1244,7 @@
             </w:tabs>
             <w:rPr/>
           </w:pPr>
-          <w:hyperlink w:anchor="__RefHeading___Toc3864_1075034909" w:tooltip="2.3. Yêu cầu phi chức năng">
+          <w:hyperlink w:anchor="__RefHeading___Toc3864_1528650690" w:tooltip="2.3. Yêu cầu phi chức năng">
             <w:r>
               <w:rPr>
                 <w:rStyle w:val="IndexLink"/>
@@ -1271,7 +1271,7 @@
             </w:tabs>
             <w:rPr/>
           </w:pPr>
-          <w:hyperlink w:anchor="__RefHeading___Toc3866_1075034909" w:tooltip="2.4. Các luồng nghiệp vụ trọng tâm">
+          <w:hyperlink w:anchor="__RefHeading___Toc3866_1528650690" w:tooltip="2.4. Các luồng nghiệp vụ trọng tâm">
             <w:r>
               <w:rPr>
                 <w:rStyle w:val="IndexLink"/>
@@ -1298,7 +1298,7 @@
             </w:tabs>
             <w:rPr/>
           </w:pPr>
-          <w:hyperlink w:anchor="__RefHeading___Toc3868_1075034909" w:tooltip="2.4.1. Chuỗi chiến lược đến đánh giá">
+          <w:hyperlink w:anchor="__RefHeading___Toc3868_1528650690" w:tooltip="2.4.1. Chuỗi chiến lược đến đánh giá">
             <w:r>
               <w:rPr>
                 <w:rStyle w:val="IndexLink"/>
@@ -1325,7 +1325,7 @@
             </w:tabs>
             <w:rPr/>
           </w:pPr>
-          <w:hyperlink w:anchor="__RefHeading___Toc3870_1075034909" w:tooltip="2.4.2. Goal Planning có phê duyệt">
+          <w:hyperlink w:anchor="__RefHeading___Toc3870_1528650690" w:tooltip="2.4.2. Goal Planning có phê duyệt">
             <w:r>
               <w:rPr>
                 <w:rStyle w:val="IndexLink"/>
@@ -1352,7 +1352,7 @@
             </w:tabs>
             <w:rPr/>
           </w:pPr>
-          <w:hyperlink w:anchor="__RefHeading___Toc3872_1075034909" w:tooltip="2.4.3. Check-in AI Evaluator">
+          <w:hyperlink w:anchor="__RefHeading___Toc3872_1528650690" w:tooltip="2.4.3. Check-in AI Evaluator">
             <w:r>
               <w:rPr>
                 <w:rStyle w:val="IndexLink"/>
@@ -1379,7 +1379,7 @@
             </w:tabs>
             <w:rPr/>
           </w:pPr>
-          <w:hyperlink w:anchor="__RefHeading___Toc3874_1075034909" w:tooltip="CHƯƠNG 3: THIẾT KẾ SẢN PHẨM">
+          <w:hyperlink w:anchor="__RefHeading___Toc3874_1528650690" w:tooltip="CHƯƠNG 3: THIẾT KẾ SẢN PHẨM">
             <w:r>
               <w:rPr>
                 <w:rStyle w:val="IndexLink"/>
@@ -1406,7 +1406,7 @@
             </w:tabs>
             <w:rPr/>
           </w:pPr>
-          <w:hyperlink w:anchor="__RefHeading___Toc3876_1075034909" w:tooltip="3.1. Kiến trúc tổng thể">
+          <w:hyperlink w:anchor="__RefHeading___Toc3876_1528650690" w:tooltip="3.1. Kiến trúc tổng thể">
             <w:r>
               <w:rPr>
                 <w:rStyle w:val="IndexLink"/>
@@ -1433,7 +1433,7 @@
             </w:tabs>
             <w:rPr/>
           </w:pPr>
-          <w:hyperlink w:anchor="__RefHeading___Toc3878_1075034909" w:tooltip="3.2. Thiết kế dữ liệu">
+          <w:hyperlink w:anchor="__RefHeading___Toc3878_1528650690" w:tooltip="3.2. Thiết kế dữ liệu">
             <w:r>
               <w:rPr>
                 <w:rStyle w:val="IndexLink"/>
@@ -1460,7 +1460,7 @@
             </w:tabs>
             <w:rPr/>
           </w:pPr>
-          <w:hyperlink w:anchor="__RefHeading___Toc3880_1075034909" w:tooltip="3.3. Thiết kế bảo mật đa tenant">
+          <w:hyperlink w:anchor="__RefHeading___Toc3880_1528650690" w:tooltip="3.3. Thiết kế bảo mật đa tenant">
             <w:r>
               <w:rPr>
                 <w:rStyle w:val="IndexLink"/>
@@ -1487,7 +1487,7 @@
             </w:tabs>
             <w:rPr/>
           </w:pPr>
-          <w:hyperlink w:anchor="__RefHeading___Toc3882_1075034909" w:tooltip="3.4. Thiết kế giao diện">
+          <w:hyperlink w:anchor="__RefHeading___Toc3882_1528650690" w:tooltip="3.4. Thiết kế giao diện">
             <w:r>
               <w:rPr>
                 <w:rStyle w:val="IndexLink"/>
@@ -1514,7 +1514,7 @@
             </w:tabs>
             <w:rPr/>
           </w:pPr>
-          <w:hyperlink w:anchor="__RefHeading___Toc3884_1075034909" w:tooltip="CHƯƠNG 4: THỰC THI MÃ NGUỒN">
+          <w:hyperlink w:anchor="__RefHeading___Toc3884_1528650690" w:tooltip="CHƯƠNG 4: THỰC THI MÃ NGUỒN">
             <w:r>
               <w:rPr>
                 <w:rStyle w:val="IndexLink"/>
@@ -1541,7 +1541,7 @@
             </w:tabs>
             <w:rPr/>
           </w:pPr>
-          <w:hyperlink w:anchor="__RefHeading___Toc3886_1075034909" w:tooltip="4.1. Công nghệ sử dụng">
+          <w:hyperlink w:anchor="__RefHeading___Toc3886_1528650690" w:tooltip="4.1. Công nghệ sử dụng">
             <w:r>
               <w:rPr>
                 <w:rStyle w:val="IndexLink"/>
@@ -1568,7 +1568,7 @@
             </w:tabs>
             <w:rPr/>
           </w:pPr>
-          <w:hyperlink w:anchor="__RefHeading___Toc3888_1075034909" w:tooltip="4.2. Tổ chức mã nguồn">
+          <w:hyperlink w:anchor="__RefHeading___Toc3888_1528650690" w:tooltip="4.2. Tổ chức mã nguồn">
             <w:r>
               <w:rPr>
                 <w:rStyle w:val="IndexLink"/>
@@ -1595,7 +1595,7 @@
             </w:tabs>
             <w:rPr/>
           </w:pPr>
-          <w:hyperlink w:anchor="__RefHeading___Toc3890_1075034909" w:tooltip="4.3. Các luồng AI-native đã triển khai">
+          <w:hyperlink w:anchor="__RefHeading___Toc3890_1528650690" w:tooltip="4.3. Các luồng AI-native đã triển khai">
             <w:r>
               <w:rPr>
                 <w:rStyle w:val="IndexLink"/>
@@ -1622,7 +1622,7 @@
             </w:tabs>
             <w:rPr/>
           </w:pPr>
-          <w:hyperlink w:anchor="__RefHeading___Toc3892_1075034909" w:tooltip="4.4. Hợp đồng AI an toàn">
+          <w:hyperlink w:anchor="__RefHeading___Toc3892_1528650690" w:tooltip="4.4. Hợp đồng AI an toàn">
             <w:r>
               <w:rPr>
                 <w:rStyle w:val="IndexLink"/>
@@ -1649,7 +1649,7 @@
             </w:tabs>
             <w:rPr/>
           </w:pPr>
-          <w:hyperlink w:anchor="__RefHeading___Toc3894_1075034909" w:tooltip="4.5. Goal Planning và durable execution">
+          <w:hyperlink w:anchor="__RefHeading___Toc3894_1528650690" w:tooltip="4.5. Goal Planning và durable execution">
             <w:r>
               <w:rPr>
                 <w:rStyle w:val="IndexLink"/>
@@ -1676,7 +1676,7 @@
             </w:tabs>
             <w:rPr/>
           </w:pPr>
-          <w:hyperlink w:anchor="__RefHeading___Toc3896_1075034909" w:tooltip="4.6. Check-in Evaluator và rubric có phiên bản">
+          <w:hyperlink w:anchor="__RefHeading___Toc3896_1528650690" w:tooltip="4.6. Check-in Evaluator và rubric có phiên bản">
             <w:r>
               <w:rPr>
                 <w:rStyle w:val="IndexLink"/>
@@ -1703,7 +1703,7 @@
             </w:tabs>
             <w:rPr/>
           </w:pPr>
-          <w:hyperlink w:anchor="__RefHeading___Toc3898_1075034909" w:tooltip="4.7. Sơ đồ tuần tự advisor có nguồn">
+          <w:hyperlink w:anchor="__RefHeading___Toc3898_1528650690" w:tooltip="4.7. Sơ đồ tuần tự advisor có nguồn">
             <w:r>
               <w:rPr>
                 <w:rStyle w:val="IndexLink"/>
@@ -1730,7 +1730,7 @@
             </w:tabs>
             <w:rPr/>
           </w:pPr>
-          <w:hyperlink w:anchor="__RefHeading___Toc3900_1075034909" w:tooltip="4.8. Pipeline tài liệu RAG">
+          <w:hyperlink w:anchor="__RefHeading___Toc3900_1528650690" w:tooltip="4.8. Pipeline tài liệu RAG">
             <w:r>
               <w:rPr>
                 <w:rStyle w:val="IndexLink"/>
@@ -1757,7 +1757,7 @@
             </w:tabs>
             <w:rPr/>
           </w:pPr>
-          <w:hyperlink w:anchor="__RefHeading___Toc3902_1075034909" w:tooltip="4.9. Cô lập tenant và RLS">
+          <w:hyperlink w:anchor="__RefHeading___Toc3902_1528650690" w:tooltip="4.9. Cô lập tenant và RLS">
             <w:r>
               <w:rPr>
                 <w:rStyle w:val="IndexLink"/>
@@ -1784,7 +1784,7 @@
             </w:tabs>
             <w:rPr/>
           </w:pPr>
-          <w:hyperlink w:anchor="__RefHeading___Toc3904_1075034909" w:tooltip="CHƯƠNG 5: KIỂM THỬ VÀ NGHIỆM THU">
+          <w:hyperlink w:anchor="__RefHeading___Toc3904_1528650690" w:tooltip="CHƯƠNG 5: KIỂM THỬ VÀ NGHIỆM THU">
             <w:r>
               <w:rPr>
                 <w:rStyle w:val="IndexLink"/>
@@ -1811,7 +1811,7 @@
             </w:tabs>
             <w:rPr/>
           </w:pPr>
-          <w:hyperlink w:anchor="__RefHeading___Toc3906_1075034909" w:tooltip="5.1. Chiến lược kiểm thử">
+          <w:hyperlink w:anchor="__RefHeading___Toc3906_1528650690" w:tooltip="5.1. Chiến lược kiểm thử">
             <w:r>
               <w:rPr>
                 <w:rStyle w:val="IndexLink"/>
@@ -1838,7 +1838,7 @@
             </w:tabs>
             <w:rPr/>
           </w:pPr>
-          <w:hyperlink w:anchor="__RefHeading___Toc3908_1075034909" w:tooltip="5.2. Bằng chứng kiểm chứng bản bàn giao">
+          <w:hyperlink w:anchor="__RefHeading___Toc3908_1528650690" w:tooltip="5.2. Bằng chứng kiểm chứng bản bàn giao">
             <w:r>
               <w:rPr>
                 <w:rStyle w:val="IndexLink"/>
@@ -1865,7 +1865,7 @@
             </w:tabs>
             <w:rPr/>
           </w:pPr>
-          <w:hyperlink w:anchor="__RefHeading___Toc3910_1075034909" w:tooltip="5.3. Kịch bản nghiệm thu tiêu biểu">
+          <w:hyperlink w:anchor="__RefHeading___Toc3910_1528650690" w:tooltip="5.3. Kịch bản nghiệm thu tiêu biểu">
             <w:r>
               <w:rPr>
                 <w:rStyle w:val="IndexLink"/>
@@ -1892,7 +1892,7 @@
             </w:tabs>
             <w:rPr/>
           </w:pPr>
-          <w:hyperlink w:anchor="__RefHeading___Toc3912_1075034909" w:tooltip="5.4. Kết luận nghiệm thu">
+          <w:hyperlink w:anchor="__RefHeading___Toc3912_1528650690" w:tooltip="5.4. Kết luận nghiệm thu">
             <w:r>
               <w:rPr>
                 <w:rStyle w:val="IndexLink"/>
@@ -1919,7 +1919,7 @@
             </w:tabs>
             <w:rPr/>
           </w:pPr>
-          <w:hyperlink w:anchor="__RefHeading___Toc3914_1075034909" w:tooltip="CHƯƠNG 6: HƯỚNG DẪN SỬ DỤNG">
+          <w:hyperlink w:anchor="__RefHeading___Toc3914_1528650690" w:tooltip="CHƯƠNG 6: HƯỚNG DẪN SỬ DỤNG">
             <w:r>
               <w:rPr>
                 <w:rStyle w:val="IndexLink"/>
@@ -1946,7 +1946,7 @@
             </w:tabs>
             <w:rPr/>
           </w:pPr>
-          <w:hyperlink w:anchor="__RefHeading___Toc3916_1075034909" w:tooltip="6.1. Khởi động môi trường trình bày">
+          <w:hyperlink w:anchor="__RefHeading___Toc3916_1528650690" w:tooltip="6.1. Khởi động môi trường trình bày">
             <w:r>
               <w:rPr>
                 <w:rStyle w:val="IndexLink"/>
@@ -1973,7 +1973,7 @@
             </w:tabs>
             <w:rPr/>
           </w:pPr>
-          <w:hyperlink w:anchor="__RefHeading___Toc3918_1075034909" w:tooltip="6.2. Hướng dẫn theo vai trò">
+          <w:hyperlink w:anchor="__RefHeading___Toc3918_1528650690" w:tooltip="6.2. Hướng dẫn theo vai trò">
             <w:r>
               <w:rPr>
                 <w:rStyle w:val="IndexLink"/>
@@ -2000,7 +2000,7 @@
             </w:tabs>
             <w:rPr/>
           </w:pPr>
-          <w:hyperlink w:anchor="__RefHeading___Toc3920_1075034909" w:tooltip="6.2.1. Admin">
+          <w:hyperlink w:anchor="__RefHeading___Toc3920_1528650690" w:tooltip="6.2.1. Admin">
             <w:r>
               <w:rPr>
                 <w:rStyle w:val="IndexLink"/>
@@ -2027,7 +2027,7 @@
             </w:tabs>
             <w:rPr/>
           </w:pPr>
-          <w:hyperlink w:anchor="__RefHeading___Toc3922_1075034909" w:tooltip="6.2.2. Director">
+          <w:hyperlink w:anchor="__RefHeading___Toc3922_1528650690" w:tooltip="6.2.2. Director">
             <w:r>
               <w:rPr>
                 <w:rStyle w:val="IndexLink"/>
@@ -2054,7 +2054,7 @@
             </w:tabs>
             <w:rPr/>
           </w:pPr>
-          <w:hyperlink w:anchor="__RefHeading___Toc3924_1075034909" w:tooltip="6.2.3. Manager">
+          <w:hyperlink w:anchor="__RefHeading___Toc3924_1528650690" w:tooltip="6.2.3. Manager">
             <w:r>
               <w:rPr>
                 <w:rStyle w:val="IndexLink"/>
@@ -2081,7 +2081,7 @@
             </w:tabs>
             <w:rPr/>
           </w:pPr>
-          <w:hyperlink w:anchor="__RefHeading___Toc3926_1075034909" w:tooltip="6.2.4. Employee">
+          <w:hyperlink w:anchor="__RefHeading___Toc3926_1528650690" w:tooltip="6.2.4. Employee">
             <w:r>
               <w:rPr>
                 <w:rStyle w:val="IndexLink"/>
@@ -2108,7 +2108,7 @@
             </w:tabs>
             <w:rPr/>
           </w:pPr>
-          <w:hyperlink w:anchor="__RefHeading___Toc3928_1075034909" w:tooltip="6.3. Hướng dẫn các tính năng AI-native">
+          <w:hyperlink w:anchor="__RefHeading___Toc3928_1528650690" w:tooltip="6.3. Hướng dẫn các tính năng AI-native">
             <w:r>
               <w:rPr>
                 <w:rStyle w:val="IndexLink"/>
@@ -2135,7 +2135,7 @@
             </w:tabs>
             <w:rPr/>
           </w:pPr>
-          <w:hyperlink w:anchor="__RefHeading___Toc3930_1075034909" w:tooltip="6.3.1. Goal Planning Agent">
+          <w:hyperlink w:anchor="__RefHeading___Toc3930_1528650690" w:tooltip="6.3.1. Goal Planning Agent">
             <w:r>
               <w:rPr>
                 <w:rStyle w:val="IndexLink"/>
@@ -2162,7 +2162,7 @@
             </w:tabs>
             <w:rPr/>
           </w:pPr>
-          <w:hyperlink w:anchor="__RefHeading___Toc3932_1075034909" w:tooltip="6.3.2. Check-in AI Evaluator">
+          <w:hyperlink w:anchor="__RefHeading___Toc3932_1528650690" w:tooltip="6.3.2. Check-in AI Evaluator">
             <w:r>
               <w:rPr>
                 <w:rStyle w:val="IndexLink"/>
@@ -2189,7 +2189,7 @@
             </w:tabs>
             <w:rPr/>
           </w:pPr>
-          <w:hyperlink w:anchor="__RefHeading___Toc3934_1075034909" w:tooltip="6.3.3. Gợi ý KPI và KR">
+          <w:hyperlink w:anchor="__RefHeading___Toc3934_1528650690" w:tooltip="6.3.3. Gợi ý KPI và KR">
             <w:r>
               <w:rPr>
                 <w:rStyle w:val="IndexLink"/>
@@ -2216,7 +2216,7 @@
             </w:tabs>
             <w:rPr/>
           </w:pPr>
-          <w:hyperlink w:anchor="__RefHeading___Toc3936_1075034909" w:tooltip="6.3.4. Chat và phân tích hiệu suất">
+          <w:hyperlink w:anchor="__RefHeading___Toc3936_1528650690" w:tooltip="6.3.4. Chat và phân tích hiệu suất">
             <w:r>
               <w:rPr>
                 <w:rStyle w:val="IndexLink"/>
@@ -2243,7 +2243,7 @@
             </w:tabs>
             <w:rPr/>
           </w:pPr>
-          <w:hyperlink w:anchor="__RefHeading___Toc3938_1075034909" w:tooltip="6.3.5. Quản lý rubric">
+          <w:hyperlink w:anchor="__RefHeading___Toc3938_1528650690" w:tooltip="6.3.5. Quản lý rubric">
             <w:r>
               <w:rPr>
                 <w:rStyle w:val="IndexLink"/>
@@ -2270,7 +2270,7 @@
             </w:tabs>
             <w:rPr/>
           </w:pPr>
-          <w:hyperlink w:anchor="__RefHeading___Toc3940_1075034909" w:tooltip="6.4. Nguyên tắc sử dụng an toàn">
+          <w:hyperlink w:anchor="__RefHeading___Toc3940_1528650690" w:tooltip="6.4. Nguyên tắc sử dụng an toàn">
             <w:r>
               <w:rPr>
                 <w:rStyle w:val="IndexLink"/>
@@ -2297,7 +2297,7 @@
             </w:tabs>
             <w:rPr/>
           </w:pPr>
-          <w:hyperlink w:anchor="__RefHeading___Toc3942_1075034909" w:tooltip="CHƯƠNG 7: TỔNG KẾT VÀ ĐÁNH GIÁ">
+          <w:hyperlink w:anchor="__RefHeading___Toc3942_1528650690" w:tooltip="CHƯƠNG 7: TỔNG KẾT VÀ ĐÁNH GIÁ">
             <w:r>
               <w:rPr>
                 <w:rStyle w:val="IndexLink"/>
@@ -2324,7 +2324,7 @@
             </w:tabs>
             <w:rPr/>
           </w:pPr>
-          <w:hyperlink w:anchor="__RefHeading___Toc3944_1075034909" w:tooltip="7.1. Kết quả thực hiện">
+          <w:hyperlink w:anchor="__RefHeading___Toc3944_1528650690" w:tooltip="7.1. Kết quả thực hiện">
             <w:r>
               <w:rPr>
                 <w:rStyle w:val="IndexLink"/>
@@ -2351,7 +2351,7 @@
             </w:tabs>
             <w:rPr/>
           </w:pPr>
-          <w:hyperlink w:anchor="__RefHeading___Toc3946_1075034909" w:tooltip="7.2. Giá trị nổi bật của sản phẩm">
+          <w:hyperlink w:anchor="__RefHeading___Toc3946_1528650690" w:tooltip="7.2. Giá trị nổi bật của sản phẩm">
             <w:r>
               <w:rPr>
                 <w:rStyle w:val="IndexLink"/>
@@ -2378,7 +2378,7 @@
             </w:tabs>
             <w:rPr/>
           </w:pPr>
-          <w:hyperlink w:anchor="__RefHeading___Toc3948_1075034909" w:tooltip="7.3. Bài học kỹ thuật">
+          <w:hyperlink w:anchor="__RefHeading___Toc3948_1528650690" w:tooltip="7.3. Bài học kỹ thuật">
             <w:r>
               <w:rPr>
                 <w:rStyle w:val="IndexLink"/>
@@ -2405,7 +2405,7 @@
             </w:tabs>
             <w:rPr/>
           </w:pPr>
-          <w:hyperlink w:anchor="__RefHeading___Toc3950_1075034909" w:tooltip="7.4. Kết luận">
+          <w:hyperlink w:anchor="__RefHeading___Toc3950_1528650690" w:tooltip="7.4. Kết luận">
             <w:r>
               <w:rPr>
                 <w:rStyle w:val="IndexLink"/>
@@ -2432,7 +2432,7 @@
             </w:tabs>
             <w:rPr/>
           </w:pPr>
-          <w:hyperlink w:anchor="__RefHeading___Toc3952_1075034909" w:tooltip="PHỤ LỤC A: CÁC ENDPOINT VÀ MÀN HÌNH CHÍNH">
+          <w:hyperlink w:anchor="__RefHeading___Toc3952_1528650690" w:tooltip="PHỤ LỤC A: CÁC ENDPOINT VÀ MÀN HÌNH CHÍNH">
             <w:r>
               <w:rPr>
                 <w:rStyle w:val="IndexLink"/>
@@ -2459,7 +2459,7 @@
             </w:tabs>
             <w:rPr/>
           </w:pPr>
-          <w:hyperlink w:anchor="__RefHeading___Toc3954_1075034909" w:tooltip="PHỤ LỤC B: HỒ SƠ DỮ LIỆU AI-NATIVE">
+          <w:hyperlink w:anchor="__RefHeading___Toc3954_1528650690" w:tooltip="PHỤ LỤC B: HỒ SƠ DỮ LIỆU AI-NATIVE">
             <w:r>
               <w:rPr>
                 <w:rStyle w:val="IndexLink"/>
@@ -2486,7 +2486,7 @@
             </w:tabs>
             <w:rPr/>
           </w:pPr>
-          <w:hyperlink w:anchor="__RefHeading___Toc3956_1075034909" w:tooltip="PHỤ LỤC C: LỆNH KIỂM CHỨNG">
+          <w:hyperlink w:anchor="__RefHeading___Toc3956_1528650690" w:tooltip="PHỤ LỤC C: LỆNH KIỂM CHỨNG">
             <w:r>
               <w:rPr>
                 <w:rStyle w:val="IndexLink"/>
@@ -2513,7 +2513,7 @@
             </w:tabs>
             <w:rPr/>
           </w:pPr>
-          <w:hyperlink w:anchor="__RefHeading___Toc3958_1075034909" w:tooltip="PHỤ LỤC D: THÔNG TIN BÀN GIAO">
+          <w:hyperlink w:anchor="__RefHeading___Toc3958_1528650690" w:tooltip="PHỤ LỤC D: THÔNG TIN BÀN GIAO">
             <w:r>
               <w:rPr>
                 <w:rStyle w:val="IndexLink"/>
@@ -2559,7 +2559,7 @@
         <w:jc w:val="center"/>
         <w:rPr/>
       </w:pPr>
-      <w:bookmarkStart w:id="1" w:name="__RefHeading___Toc3822_1075034909"/>
+      <w:bookmarkStart w:id="1" w:name="__RefHeading___Toc3822_1528650690"/>
       <w:bookmarkEnd w:id="1"/>
       <w:r>
         <w:rPr>
@@ -2841,7 +2841,7 @@
         <w:jc w:val="center"/>
         <w:rPr/>
       </w:pPr>
-      <w:bookmarkStart w:id="2" w:name="__RefHeading___Toc3824_1075034909"/>
+      <w:bookmarkStart w:id="2" w:name="__RefHeading___Toc3824_1528650690"/>
       <w:bookmarkEnd w:id="2"/>
       <w:r>
         <w:rPr>
@@ -3453,7 +3453,7 @@
         <w:jc w:val="center"/>
         <w:rPr/>
       </w:pPr>
-      <w:bookmarkStart w:id="3" w:name="__RefHeading___Toc3826_1075034909"/>
+      <w:bookmarkStart w:id="3" w:name="__RefHeading___Toc3826_1528650690"/>
       <w:bookmarkEnd w:id="3"/>
       <w:r>
         <w:rPr>
@@ -3976,7 +3976,7 @@
         <w:jc w:val="center"/>
         <w:rPr/>
       </w:pPr>
-      <w:bookmarkStart w:id="4" w:name="__RefHeading___Toc3828_1075034909"/>
+      <w:bookmarkStart w:id="4" w:name="__RefHeading___Toc3828_1528650690"/>
       <w:bookmarkEnd w:id="4"/>
       <w:r>
         <w:rPr>
@@ -5766,7 +5766,7 @@
         <w:jc w:val="center"/>
         <w:rPr/>
       </w:pPr>
-      <w:bookmarkStart w:id="5" w:name="__RefHeading___Toc3830_1075034909"/>
+      <w:bookmarkStart w:id="5" w:name="__RefHeading___Toc3830_1528650690"/>
       <w:bookmarkEnd w:id="5"/>
       <w:r>
         <w:rPr>
@@ -6982,7 +6982,7 @@
         <w:jc w:val="center"/>
         <w:rPr/>
       </w:pPr>
-      <w:bookmarkStart w:id="6" w:name="__RefHeading___Toc3832_1075034909"/>
+      <w:bookmarkStart w:id="6" w:name="__RefHeading___Toc3832_1528650690"/>
       <w:bookmarkEnd w:id="6"/>
       <w:r>
         <w:rPr>
@@ -7048,7 +7048,7 @@
         <w:jc w:val="center"/>
         <w:rPr/>
       </w:pPr>
-      <w:bookmarkStart w:id="7" w:name="__RefHeading___Toc3834_1075034909"/>
+      <w:bookmarkStart w:id="7" w:name="__RefHeading___Toc3834_1528650690"/>
       <w:bookmarkEnd w:id="7"/>
       <w:r>
         <w:rPr>
@@ -7116,7 +7116,7 @@
         <w:jc w:val="center"/>
         <w:rPr/>
       </w:pPr>
-      <w:bookmarkStart w:id="8" w:name="__RefHeading___Toc3836_1075034909"/>
+      <w:bookmarkStart w:id="8" w:name="__RefHeading___Toc3836_1528650690"/>
       <w:bookmarkEnd w:id="8"/>
       <w:r>
         <w:rPr>
@@ -7179,7 +7179,7 @@
           <w:i w:val="false"/>
           <w:sz w:val="28"/>
         </w:rPr>
-        <w:t>Phiên bản báo cáo này tập trung vào phạm vi đã hoàn tất và được kiểm chứng. Bằng chứng kỹ thuật gồm build sạch, 539 kiểm thử tự động đạt, migration SQL Server có diễn tập Up/Down và các kiểm thử cô lập tenant, cạnh tranh đồng thời, stale source cùng durable outbox.</w:t>
+        <w:t>Phiên bản báo cáo này tập trung vào phạm vi đã hoàn tất và được kiểm chứng. Bằng chứng kỹ thuật gồm build sạch, 540 kiểm thử tự động đạt, migration SQL Server có diễn tập Up/Down và các kiểm thử cô lập tenant, cạnh tranh đồng thời, stale source cùng durable outbox.</w:t>
       </w:r>
     </w:p>
     <w:p>
@@ -7202,7 +7202,7 @@
         <w:jc w:val="center"/>
         <w:rPr/>
       </w:pPr>
-      <w:bookmarkStart w:id="9" w:name="__RefHeading___Toc3838_1075034909"/>
+      <w:bookmarkStart w:id="9" w:name="__RefHeading___Toc3838_1528650690"/>
       <w:bookmarkEnd w:id="9"/>
       <w:r>
         <w:rPr>
@@ -7270,7 +7270,7 @@
         <w:jc w:val="center"/>
         <w:rPr/>
       </w:pPr>
-      <w:bookmarkStart w:id="10" w:name="__RefHeading___Toc3840_1075034909"/>
+      <w:bookmarkStart w:id="10" w:name="__RefHeading___Toc3840_1528650690"/>
       <w:bookmarkEnd w:id="10"/>
       <w:r>
         <w:rPr>
@@ -7288,7 +7288,7 @@
         <w:jc w:val="start"/>
         <w:rPr/>
       </w:pPr>
-      <w:bookmarkStart w:id="11" w:name="__RefHeading___Toc3842_1075034909"/>
+      <w:bookmarkStart w:id="11" w:name="__RefHeading___Toc3842_1528650690"/>
       <w:bookmarkEnd w:id="11"/>
       <w:r>
         <w:rPr>
@@ -7306,7 +7306,7 @@
         <w:jc w:val="start"/>
         <w:rPr/>
       </w:pPr>
-      <w:bookmarkStart w:id="12" w:name="__RefHeading___Toc3844_1075034909"/>
+      <w:bookmarkStart w:id="12" w:name="__RefHeading___Toc3844_1528650690"/>
       <w:bookmarkEnd w:id="12"/>
       <w:r>
         <w:rPr>
@@ -7360,7 +7360,7 @@
         <w:jc w:val="start"/>
         <w:rPr/>
       </w:pPr>
-      <w:bookmarkStart w:id="13" w:name="__RefHeading___Toc3846_1075034909"/>
+      <w:bookmarkStart w:id="13" w:name="__RefHeading___Toc3846_1528650690"/>
       <w:bookmarkEnd w:id="13"/>
       <w:r>
         <w:rPr>
@@ -7522,7 +7522,7 @@
         <w:jc w:val="start"/>
         <w:rPr/>
       </w:pPr>
-      <w:bookmarkStart w:id="14" w:name="__RefHeading___Toc3848_1075034909"/>
+      <w:bookmarkStart w:id="14" w:name="__RefHeading___Toc3848_1528650690"/>
       <w:bookmarkEnd w:id="14"/>
       <w:r>
         <w:rPr>
@@ -7540,7 +7540,7 @@
         <w:jc w:val="start"/>
         <w:rPr/>
       </w:pPr>
-      <w:bookmarkStart w:id="15" w:name="__RefHeading___Toc3850_1075034909"/>
+      <w:bookmarkStart w:id="15" w:name="__RefHeading___Toc3850_1528650690"/>
       <w:bookmarkEnd w:id="15"/>
       <w:r>
         <w:rPr>
@@ -7576,7 +7576,7 @@
         <w:jc w:val="start"/>
         <w:rPr/>
       </w:pPr>
-      <w:bookmarkStart w:id="16" w:name="__RefHeading___Toc3852_1075034909"/>
+      <w:bookmarkStart w:id="16" w:name="__RefHeading___Toc3852_1528650690"/>
       <w:bookmarkEnd w:id="16"/>
       <w:r>
         <w:rPr>
@@ -7882,7 +7882,7 @@
         <w:jc w:val="start"/>
         <w:rPr/>
       </w:pPr>
-      <w:bookmarkStart w:id="17" w:name="__RefHeading___Toc3854_1075034909"/>
+      <w:bookmarkStart w:id="17" w:name="__RefHeading___Toc3854_1528650690"/>
       <w:bookmarkEnd w:id="17"/>
       <w:r>
         <w:rPr>
@@ -8134,7 +8134,7 @@
         <w:jc w:val="start"/>
         <w:rPr/>
       </w:pPr>
-      <w:bookmarkStart w:id="18" w:name="__RefHeading___Toc3856_1075034909"/>
+      <w:bookmarkStart w:id="18" w:name="__RefHeading___Toc3856_1528650690"/>
       <w:bookmarkEnd w:id="18"/>
       <w:r>
         <w:rPr>
@@ -8310,7 +8310,7 @@
         <w:jc w:val="center"/>
         <w:rPr/>
       </w:pPr>
-      <w:bookmarkStart w:id="19" w:name="__RefHeading___Toc3858_1075034909"/>
+      <w:bookmarkStart w:id="19" w:name="__RefHeading___Toc3858_1528650690"/>
       <w:bookmarkEnd w:id="19"/>
       <w:r>
         <w:rPr>
@@ -8328,7 +8328,7 @@
         <w:jc w:val="start"/>
         <w:rPr/>
       </w:pPr>
-      <w:bookmarkStart w:id="20" w:name="__RefHeading___Toc3860_1075034909"/>
+      <w:bookmarkStart w:id="20" w:name="__RefHeading___Toc3860_1528650690"/>
       <w:bookmarkEnd w:id="20"/>
       <w:r>
         <w:rPr>
@@ -9156,7 +9156,7 @@
         <w:jc w:val="start"/>
         <w:rPr/>
       </w:pPr>
-      <w:bookmarkStart w:id="21" w:name="__RefHeading___Toc3862_1075034909"/>
+      <w:bookmarkStart w:id="21" w:name="__RefHeading___Toc3862_1528650690"/>
       <w:bookmarkEnd w:id="21"/>
       <w:r>
         <w:rPr>
@@ -10828,7 +10828,7 @@
         <w:jc w:val="start"/>
         <w:rPr/>
       </w:pPr>
-      <w:bookmarkStart w:id="22" w:name="__RefHeading___Toc3864_1075034909"/>
+      <w:bookmarkStart w:id="22" w:name="__RefHeading___Toc3864_1528650690"/>
       <w:bookmarkEnd w:id="22"/>
       <w:r>
         <w:rPr>
@@ -11134,7 +11134,7 @@
         <w:jc w:val="start"/>
         <w:rPr/>
       </w:pPr>
-      <w:bookmarkStart w:id="23" w:name="__RefHeading___Toc3866_1075034909"/>
+      <w:bookmarkStart w:id="23" w:name="__RefHeading___Toc3866_1528650690"/>
       <w:bookmarkEnd w:id="23"/>
       <w:r>
         <w:rPr>
@@ -11152,7 +11152,7 @@
         <w:jc w:val="start"/>
         <w:rPr/>
       </w:pPr>
-      <w:bookmarkStart w:id="24" w:name="__RefHeading___Toc3868_1075034909"/>
+      <w:bookmarkStart w:id="24" w:name="__RefHeading___Toc3868_1528650690"/>
       <w:bookmarkEnd w:id="24"/>
       <w:r>
         <w:rPr>
@@ -11188,7 +11188,7 @@
         <w:jc w:val="start"/>
         <w:rPr/>
       </w:pPr>
-      <w:bookmarkStart w:id="25" w:name="__RefHeading___Toc3870_1075034909"/>
+      <w:bookmarkStart w:id="25" w:name="__RefHeading___Toc3870_1528650690"/>
       <w:bookmarkEnd w:id="25"/>
       <w:r>
         <w:rPr>
@@ -11224,7 +11224,7 @@
         <w:jc w:val="start"/>
         <w:rPr/>
       </w:pPr>
-      <w:bookmarkStart w:id="26" w:name="__RefHeading___Toc3872_1075034909"/>
+      <w:bookmarkStart w:id="26" w:name="__RefHeading___Toc3872_1528650690"/>
       <w:bookmarkEnd w:id="26"/>
       <w:r>
         <w:rPr>
@@ -11274,7 +11274,7 @@
         <w:jc w:val="center"/>
         <w:rPr/>
       </w:pPr>
-      <w:bookmarkStart w:id="27" w:name="__RefHeading___Toc3874_1075034909"/>
+      <w:bookmarkStart w:id="27" w:name="__RefHeading___Toc3874_1528650690"/>
       <w:bookmarkEnd w:id="27"/>
       <w:r>
         <w:rPr>
@@ -11292,7 +11292,7 @@
         <w:jc w:val="start"/>
         <w:rPr/>
       </w:pPr>
-      <w:bookmarkStart w:id="28" w:name="__RefHeading___Toc3876_1075034909"/>
+      <w:bookmarkStart w:id="28" w:name="__RefHeading___Toc3876_1528650690"/>
       <w:bookmarkEnd w:id="28"/>
       <w:r>
         <w:rPr>
@@ -12031,7 +12031,7 @@
         <w:jc w:val="start"/>
         <w:rPr/>
       </w:pPr>
-      <w:bookmarkStart w:id="29" w:name="__RefHeading___Toc3878_1075034909"/>
+      <w:bookmarkStart w:id="29" w:name="__RefHeading___Toc3878_1528650690"/>
       <w:bookmarkEnd w:id="29"/>
       <w:r>
         <w:rPr>
@@ -13596,7 +13596,7 @@
         <w:jc w:val="start"/>
         <w:rPr/>
       </w:pPr>
-      <w:bookmarkStart w:id="30" w:name="__RefHeading___Toc3880_1075034909"/>
+      <w:bookmarkStart w:id="30" w:name="__RefHeading___Toc3880_1528650690"/>
       <w:bookmarkEnd w:id="30"/>
       <w:r>
         <w:rPr>
@@ -13794,7 +13794,7 @@
         <w:jc w:val="start"/>
         <w:rPr/>
       </w:pPr>
-      <w:bookmarkStart w:id="31" w:name="__RefHeading___Toc3882_1075034909"/>
+      <w:bookmarkStart w:id="31" w:name="__RefHeading___Toc3882_1528650690"/>
       <w:bookmarkEnd w:id="31"/>
       <w:r>
         <w:rPr>
@@ -14408,7 +14408,7 @@
         <w:jc w:val="center"/>
         <w:rPr/>
       </w:pPr>
-      <w:bookmarkStart w:id="32" w:name="__RefHeading___Toc3884_1075034909"/>
+      <w:bookmarkStart w:id="32" w:name="__RefHeading___Toc3884_1528650690"/>
       <w:bookmarkEnd w:id="32"/>
       <w:r>
         <w:rPr>
@@ -14426,7 +14426,7 @@
         <w:jc w:val="start"/>
         <w:rPr/>
       </w:pPr>
-      <w:bookmarkStart w:id="33" w:name="__RefHeading___Toc3886_1075034909"/>
+      <w:bookmarkStart w:id="33" w:name="__RefHeading___Toc3886_1528650690"/>
       <w:bookmarkEnd w:id="33"/>
       <w:r>
         <w:rPr>
@@ -15676,7 +15676,7 @@
         <w:jc w:val="start"/>
         <w:rPr/>
       </w:pPr>
-      <w:bookmarkStart w:id="34" w:name="__RefHeading___Toc3888_1075034909"/>
+      <w:bookmarkStart w:id="34" w:name="__RefHeading___Toc3888_1528650690"/>
       <w:bookmarkEnd w:id="34"/>
       <w:r>
         <w:rPr>
@@ -15982,7 +15982,7 @@
         <w:jc w:val="start"/>
         <w:rPr/>
       </w:pPr>
-      <w:bookmarkStart w:id="35" w:name="__RefHeading___Toc3890_1075034909"/>
+      <w:bookmarkStart w:id="35" w:name="__RefHeading___Toc3890_1528650690"/>
       <w:bookmarkEnd w:id="35"/>
       <w:r>
         <w:rPr>
@@ -17125,7 +17125,7 @@
         <w:jc w:val="start"/>
         <w:rPr/>
       </w:pPr>
-      <w:bookmarkStart w:id="36" w:name="__RefHeading___Toc3892_1075034909"/>
+      <w:bookmarkStart w:id="36" w:name="__RefHeading___Toc3892_1528650690"/>
       <w:bookmarkEnd w:id="36"/>
       <w:r>
         <w:rPr>
@@ -17359,7 +17359,7 @@
         <w:jc w:val="start"/>
         <w:rPr/>
       </w:pPr>
-      <w:bookmarkStart w:id="37" w:name="__RefHeading___Toc3894_1075034909"/>
+      <w:bookmarkStart w:id="37" w:name="__RefHeading___Toc3894_1528650690"/>
       <w:bookmarkEnd w:id="37"/>
       <w:r>
         <w:rPr>
@@ -17413,7 +17413,7 @@
         <w:jc w:val="start"/>
         <w:rPr/>
       </w:pPr>
-      <w:bookmarkStart w:id="38" w:name="__RefHeading___Toc3896_1075034909"/>
+      <w:bookmarkStart w:id="38" w:name="__RefHeading___Toc3896_1528650690"/>
       <w:bookmarkEnd w:id="38"/>
       <w:r>
         <w:rPr>
@@ -17467,7 +17467,7 @@
         <w:jc w:val="start"/>
         <w:rPr/>
       </w:pPr>
-      <w:bookmarkStart w:id="39" w:name="__RefHeading___Toc3898_1075034909"/>
+      <w:bookmarkStart w:id="39" w:name="__RefHeading___Toc3898_1528650690"/>
       <w:bookmarkEnd w:id="39"/>
       <w:r>
         <w:rPr>
@@ -17597,7 +17597,7 @@
         <w:jc w:val="start"/>
         <w:rPr/>
       </w:pPr>
-      <w:bookmarkStart w:id="40" w:name="__RefHeading___Toc3900_1075034909"/>
+      <w:bookmarkStart w:id="40" w:name="__RefHeading___Toc3900_1528650690"/>
       <w:bookmarkEnd w:id="40"/>
       <w:r>
         <w:rPr>
@@ -18529,7 +18529,7 @@
         <w:jc w:val="start"/>
         <w:rPr/>
       </w:pPr>
-      <w:bookmarkStart w:id="41" w:name="__RefHeading___Toc3902_1075034909"/>
+      <w:bookmarkStart w:id="41" w:name="__RefHeading___Toc3902_1528650690"/>
       <w:bookmarkEnd w:id="41"/>
       <w:r>
         <w:rPr>
@@ -18579,7 +18579,7 @@
         <w:jc w:val="center"/>
         <w:rPr/>
       </w:pPr>
-      <w:bookmarkStart w:id="42" w:name="__RefHeading___Toc3904_1075034909"/>
+      <w:bookmarkStart w:id="42" w:name="__RefHeading___Toc3904_1528650690"/>
       <w:bookmarkEnd w:id="42"/>
       <w:r>
         <w:rPr>
@@ -18597,7 +18597,7 @@
         <w:jc w:val="start"/>
         <w:rPr/>
       </w:pPr>
-      <w:bookmarkStart w:id="43" w:name="__RefHeading___Toc3906_1075034909"/>
+      <w:bookmarkStart w:id="43" w:name="__RefHeading___Toc3906_1528650690"/>
       <w:bookmarkEnd w:id="43"/>
       <w:r>
         <w:rPr>
@@ -19133,7 +19133,7 @@
         <w:jc w:val="start"/>
         <w:rPr/>
       </w:pPr>
-      <w:bookmarkStart w:id="44" w:name="__RefHeading___Toc3908_1075034909"/>
+      <w:bookmarkStart w:id="44" w:name="__RefHeading___Toc3908_1528650690"/>
       <w:bookmarkEnd w:id="44"/>
       <w:r>
         <w:rPr>
@@ -19482,7 +19482,7 @@
                 <w:szCs w:val="22"/>
                 <w:lang w:val="en-US" w:eastAsia="en-US" w:bidi="ar-SA"/>
               </w:rPr>
-              <w:t>539/539 kiểm thử chạy xanh tại thời điểm đóng gói báo cáo.</w:t>
+              <w:t>540/540 kiểm thử chạy xanh tại thời điểm đóng gói báo cáo.</w:t>
             </w:r>
           </w:p>
         </w:tc>
@@ -20383,7 +20383,7 @@
         <w:jc w:val="start"/>
         <w:rPr/>
       </w:pPr>
-      <w:bookmarkStart w:id="45" w:name="__RefHeading___Toc3910_1075034909"/>
+      <w:bookmarkStart w:id="45" w:name="__RefHeading___Toc3910_1528650690"/>
       <w:bookmarkEnd w:id="45"/>
       <w:r>
         <w:rPr>
@@ -21844,7 +21844,7 @@
         <w:jc w:val="start"/>
         <w:rPr/>
       </w:pPr>
-      <w:bookmarkStart w:id="46" w:name="__RefHeading___Toc3912_1075034909"/>
+      <w:bookmarkStart w:id="46" w:name="__RefHeading___Toc3912_1528650690"/>
       <w:bookmarkEnd w:id="46"/>
       <w:r>
         <w:rPr>
@@ -21894,7 +21894,7 @@
         <w:jc w:val="center"/>
         <w:rPr/>
       </w:pPr>
-      <w:bookmarkStart w:id="47" w:name="__RefHeading___Toc3914_1075034909"/>
+      <w:bookmarkStart w:id="47" w:name="__RefHeading___Toc3914_1528650690"/>
       <w:bookmarkEnd w:id="47"/>
       <w:r>
         <w:rPr>
@@ -21912,7 +21912,7 @@
         <w:jc w:val="start"/>
         <w:rPr/>
       </w:pPr>
-      <w:bookmarkStart w:id="48" w:name="__RefHeading___Toc3916_1075034909"/>
+      <w:bookmarkStart w:id="48" w:name="__RefHeading___Toc3916_1528650690"/>
       <w:bookmarkEnd w:id="48"/>
       <w:r>
         <w:rPr>
@@ -22110,7 +22110,7 @@
         <w:jc w:val="start"/>
         <w:rPr/>
       </w:pPr>
-      <w:bookmarkStart w:id="49" w:name="__RefHeading___Toc3918_1075034909"/>
+      <w:bookmarkStart w:id="49" w:name="__RefHeading___Toc3918_1528650690"/>
       <w:bookmarkEnd w:id="49"/>
       <w:r>
         <w:rPr>
@@ -22128,7 +22128,7 @@
         <w:jc w:val="start"/>
         <w:rPr/>
       </w:pPr>
-      <w:bookmarkStart w:id="50" w:name="__RefHeading___Toc3920_1075034909"/>
+      <w:bookmarkStart w:id="50" w:name="__RefHeading___Toc3920_1528650690"/>
       <w:bookmarkEnd w:id="50"/>
       <w:r>
         <w:rPr>
@@ -22254,7 +22254,7 @@
         <w:jc w:val="start"/>
         <w:rPr/>
       </w:pPr>
-      <w:bookmarkStart w:id="51" w:name="__RefHeading___Toc3922_1075034909"/>
+      <w:bookmarkStart w:id="51" w:name="__RefHeading___Toc3922_1528650690"/>
       <w:bookmarkEnd w:id="51"/>
       <w:r>
         <w:rPr>
@@ -22380,7 +22380,7 @@
         <w:jc w:val="start"/>
         <w:rPr/>
       </w:pPr>
-      <w:bookmarkStart w:id="52" w:name="__RefHeading___Toc3924_1075034909"/>
+      <w:bookmarkStart w:id="52" w:name="__RefHeading___Toc3924_1528650690"/>
       <w:bookmarkEnd w:id="52"/>
       <w:r>
         <w:rPr>
@@ -22506,7 +22506,7 @@
         <w:jc w:val="start"/>
         <w:rPr/>
       </w:pPr>
-      <w:bookmarkStart w:id="53" w:name="__RefHeading___Toc3926_1075034909"/>
+      <w:bookmarkStart w:id="53" w:name="__RefHeading___Toc3926_1528650690"/>
       <w:bookmarkEnd w:id="53"/>
       <w:r>
         <w:rPr>
@@ -22632,7 +22632,7 @@
         <w:jc w:val="start"/>
         <w:rPr/>
       </w:pPr>
-      <w:bookmarkStart w:id="54" w:name="__RefHeading___Toc3928_1075034909"/>
+      <w:bookmarkStart w:id="54" w:name="__RefHeading___Toc3928_1528650690"/>
       <w:bookmarkEnd w:id="54"/>
       <w:r>
         <w:rPr>
@@ -22650,7 +22650,7 @@
         <w:jc w:val="start"/>
         <w:rPr/>
       </w:pPr>
-      <w:bookmarkStart w:id="55" w:name="__RefHeading___Toc3930_1075034909"/>
+      <w:bookmarkStart w:id="55" w:name="__RefHeading___Toc3930_1528650690"/>
       <w:bookmarkEnd w:id="55"/>
       <w:r>
         <w:rPr>
@@ -22686,7 +22686,7 @@
         <w:jc w:val="start"/>
         <w:rPr/>
       </w:pPr>
-      <w:bookmarkStart w:id="56" w:name="__RefHeading___Toc3932_1075034909"/>
+      <w:bookmarkStart w:id="56" w:name="__RefHeading___Toc3932_1528650690"/>
       <w:bookmarkEnd w:id="56"/>
       <w:r>
         <w:rPr>
@@ -22722,7 +22722,7 @@
         <w:jc w:val="start"/>
         <w:rPr/>
       </w:pPr>
-      <w:bookmarkStart w:id="57" w:name="__RefHeading___Toc3934_1075034909"/>
+      <w:bookmarkStart w:id="57" w:name="__RefHeading___Toc3934_1528650690"/>
       <w:bookmarkEnd w:id="57"/>
       <w:r>
         <w:rPr>
@@ -22758,7 +22758,7 @@
         <w:jc w:val="start"/>
         <w:rPr/>
       </w:pPr>
-      <w:bookmarkStart w:id="58" w:name="__RefHeading___Toc3936_1075034909"/>
+      <w:bookmarkStart w:id="58" w:name="__RefHeading___Toc3936_1528650690"/>
       <w:bookmarkEnd w:id="58"/>
       <w:r>
         <w:rPr>
@@ -22794,7 +22794,7 @@
         <w:jc w:val="start"/>
         <w:rPr/>
       </w:pPr>
-      <w:bookmarkStart w:id="59" w:name="__RefHeading___Toc3938_1075034909"/>
+      <w:bookmarkStart w:id="59" w:name="__RefHeading___Toc3938_1528650690"/>
       <w:bookmarkEnd w:id="59"/>
       <w:r>
         <w:rPr>
@@ -22830,7 +22830,7 @@
         <w:jc w:val="start"/>
         <w:rPr/>
       </w:pPr>
-      <w:bookmarkStart w:id="60" w:name="__RefHeading___Toc3940_1075034909"/>
+      <w:bookmarkStart w:id="60" w:name="__RefHeading___Toc3940_1528650690"/>
       <w:bookmarkEnd w:id="60"/>
       <w:r>
         <w:rPr>
@@ -23006,7 +23006,7 @@
         <w:jc w:val="center"/>
         <w:rPr/>
       </w:pPr>
-      <w:bookmarkStart w:id="61" w:name="__RefHeading___Toc3942_1075034909"/>
+      <w:bookmarkStart w:id="61" w:name="__RefHeading___Toc3942_1528650690"/>
       <w:bookmarkEnd w:id="61"/>
       <w:r>
         <w:rPr>
@@ -23024,7 +23024,7 @@
         <w:jc w:val="start"/>
         <w:rPr/>
       </w:pPr>
-      <w:bookmarkStart w:id="62" w:name="__RefHeading___Toc3944_1075034909"/>
+      <w:bookmarkStart w:id="62" w:name="__RefHeading___Toc3944_1528650690"/>
       <w:bookmarkEnd w:id="62"/>
       <w:r>
         <w:rPr>
@@ -23078,7 +23078,7 @@
         <w:jc w:val="start"/>
         <w:rPr/>
       </w:pPr>
-      <w:bookmarkStart w:id="63" w:name="__RefHeading___Toc3946_1075034909"/>
+      <w:bookmarkStart w:id="63" w:name="__RefHeading___Toc3946_1528650690"/>
       <w:bookmarkEnd w:id="63"/>
       <w:r>
         <w:rPr>
@@ -23303,7 +23303,7 @@
           <w:i w:val="false"/>
           <w:sz w:val="28"/>
         </w:rPr>
-        <w:t>Build sạch và 539 kiểm thử tự động cùng diễn tập SQL Server tạo bằng chứng có thể lặp lại.</w:t>
+        <w:t>Build sạch và 540 kiểm thử tự động cùng diễn tập SQL Server tạo bằng chứng có thể lặp lại.</w:t>
       </w:r>
     </w:p>
     <w:p>
@@ -23312,7 +23312,7 @@
         <w:jc w:val="start"/>
         <w:rPr/>
       </w:pPr>
-      <w:bookmarkStart w:id="64" w:name="__RefHeading___Toc3948_1075034909"/>
+      <w:bookmarkStart w:id="64" w:name="__RefHeading___Toc3948_1528650690"/>
       <w:bookmarkEnd w:id="64"/>
       <w:r>
         <w:rPr>
@@ -23510,7 +23510,7 @@
         <w:jc w:val="start"/>
         <w:rPr/>
       </w:pPr>
-      <w:bookmarkStart w:id="65" w:name="__RefHeading___Toc3950_1075034909"/>
+      <w:bookmarkStart w:id="65" w:name="__RefHeading___Toc3950_1528650690"/>
       <w:bookmarkEnd w:id="65"/>
       <w:r>
         <w:rPr>
@@ -23578,7 +23578,7 @@
         <w:jc w:val="center"/>
         <w:rPr/>
       </w:pPr>
-      <w:bookmarkStart w:id="66" w:name="__RefHeading___Toc3952_1075034909"/>
+      <w:bookmarkStart w:id="66" w:name="__RefHeading___Toc3952_1528650690"/>
       <w:bookmarkEnd w:id="66"/>
       <w:r>
         <w:rPr>
@@ -24830,7 +24830,7 @@
         <w:jc w:val="center"/>
         <w:rPr/>
       </w:pPr>
-      <w:bookmarkStart w:id="67" w:name="__RefHeading___Toc3954_1075034909"/>
+      <w:bookmarkStart w:id="67" w:name="__RefHeading___Toc3954_1528650690"/>
       <w:bookmarkEnd w:id="67"/>
       <w:r>
         <w:rPr>
@@ -25938,7 +25938,7 @@
         <w:jc w:val="center"/>
         <w:rPr/>
       </w:pPr>
-      <w:bookmarkStart w:id="68" w:name="__RefHeading___Toc3956_1075034909"/>
+      <w:bookmarkStart w:id="68" w:name="__RefHeading___Toc3956_1528650690"/>
       <w:bookmarkEnd w:id="68"/>
       <w:r>
         <w:rPr>
@@ -26538,7 +26538,7 @@
           <w:i w:val="false"/>
           <w:sz w:val="28"/>
         </w:rPr>
-        <w:t>Kết quả đóng gói ngày 11/08/2026: build 0 warning/0 error và 539 kiểm thử tự động đạt. Các kiểm thử relational sử dụng SQL Server cô lập và xóa database tạm sau khi hoàn tất.</w:t>
+        <w:t>Kết quả đóng gói ngày 11/08/2026: build 0 warning/0 error và 540 kiểm thử tự động đạt. Các kiểm thử relational sử dụng SQL Server cô lập và xóa database tạm sau khi hoàn tất.</w:t>
       </w:r>
     </w:p>
     <w:p>
@@ -26561,7 +26561,7 @@
         <w:jc w:val="center"/>
         <w:rPr/>
       </w:pPr>
-      <w:bookmarkStart w:id="69" w:name="__RefHeading___Toc3958_1075034909"/>
+      <w:bookmarkStart w:id="69" w:name="__RefHeading___Toc3958_1528650690"/>
       <w:bookmarkEnd w:id="69"/>
       <w:r>
         <w:rPr>

</xml_diff>